<commit_message>
In PF Nominee added Doc Date
</commit_message>
<xml_diff>
--- a/APLOS/POPResources/Templates/NomineePSLEnglish.docx
+++ b/APLOS/POPResources/Templates/NomineePSLEnglish.docx
@@ -1,6 +1,6 @@
 
 <file path=word/document.xml><?xml version="1.0" encoding="utf-8"?>
-<w:document xmlns:wpc="http://schemas.microsoft.com/office/word/2010/wordprocessingCanvas" xmlns:mc="http://schemas.openxmlformats.org/markup-compatibility/2006" xmlns:o="urn:schemas-microsoft-com:office:office" xmlns:r="http://schemas.openxmlformats.org/officeDocument/2006/relationships" xmlns:m="http://schemas.openxmlformats.org/officeDocument/2006/math" xmlns:v="urn:schemas-microsoft-com:vml" xmlns:wp14="http://schemas.microsoft.com/office/word/2010/wordprocessingDrawing" xmlns:wp="http://schemas.openxmlformats.org/drawingml/2006/wordprocessingDrawing" xmlns:w10="urn:schemas-microsoft-com:office:word" xmlns:w="http://schemas.openxmlformats.org/wordprocessingml/2006/main" xmlns:w14="http://schemas.microsoft.com/office/word/2010/wordml" xmlns:w15="http://schemas.microsoft.com/office/word/2012/wordml" xmlns:wpg="http://schemas.microsoft.com/office/word/2010/wordprocessingGroup" xmlns:wpi="http://schemas.microsoft.com/office/word/2010/wordprocessingInk" xmlns:wne="http://schemas.microsoft.com/office/word/2006/wordml" xmlns:wps="http://schemas.microsoft.com/office/word/2010/wordprocessingShape" mc:Ignorable="w14 w15 wp14">
+<w:document xmlns:wpc="http://schemas.microsoft.com/office/word/2010/wordprocessingCanvas" xmlns:cx="http://schemas.microsoft.com/office/drawing/2014/chartex" xmlns:cx1="http://schemas.microsoft.com/office/drawing/2015/9/8/chartex" xmlns:cx2="http://schemas.microsoft.com/office/drawing/2015/10/21/chartex" xmlns:cx3="http://schemas.microsoft.com/office/drawing/2016/5/9/chartex" xmlns:cx4="http://schemas.microsoft.com/office/drawing/2016/5/10/chartex" xmlns:cx5="http://schemas.microsoft.com/office/drawing/2016/5/11/chartex" xmlns:cx6="http://schemas.microsoft.com/office/drawing/2016/5/12/chartex" xmlns:cx7="http://schemas.microsoft.com/office/drawing/2016/5/13/chartex" xmlns:cx8="http://schemas.microsoft.com/office/drawing/2016/5/14/chartex" xmlns:mc="http://schemas.openxmlformats.org/markup-compatibility/2006" xmlns:aink="http://schemas.microsoft.com/office/drawing/2016/ink" xmlns:am3d="http://schemas.microsoft.com/office/drawing/2017/model3d" xmlns:o="urn:schemas-microsoft-com:office:office" xmlns:r="http://schemas.openxmlformats.org/officeDocument/2006/relationships" xmlns:m="http://schemas.openxmlformats.org/officeDocument/2006/math" xmlns:v="urn:schemas-microsoft-com:vml" xmlns:wp14="http://schemas.microsoft.com/office/word/2010/wordprocessingDrawing" xmlns:wp="http://schemas.openxmlformats.org/drawingml/2006/wordprocessingDrawing" xmlns:w10="urn:schemas-microsoft-com:office:word" xmlns:w="http://schemas.openxmlformats.org/wordprocessingml/2006/main" xmlns:w14="http://schemas.microsoft.com/office/word/2010/wordml" xmlns:w15="http://schemas.microsoft.com/office/word/2012/wordml" xmlns:w16cex="http://schemas.microsoft.com/office/word/2018/wordml/cex" xmlns:w16cid="http://schemas.microsoft.com/office/word/2016/wordml/cid" xmlns:w16="http://schemas.microsoft.com/office/word/2018/wordml" xmlns:w16sdtdh="http://schemas.microsoft.com/office/word/2020/wordml/sdtdatahash" xmlns:w16se="http://schemas.microsoft.com/office/word/2015/wordml/symex" xmlns:wpg="http://schemas.microsoft.com/office/word/2010/wordprocessingGroup" xmlns:wpi="http://schemas.microsoft.com/office/word/2010/wordprocessingInk" xmlns:wne="http://schemas.microsoft.com/office/word/2006/wordml" xmlns:wps="http://schemas.microsoft.com/office/word/2010/wordprocessingShape" mc:Ignorable="w14 w15 w16se w16cid w16 w16cex w16sdtdh wp14">
   <w:body>
     <w:p>
       <w:pPr>
@@ -50,8 +50,6 @@
           <w:kern w:val="2"/>
         </w:rPr>
       </w:pPr>
-      <w:bookmarkStart w:id="0" w:name="_GoBack"/>
-      <w:bookmarkEnd w:id="0"/>
     </w:p>
     <w:p>
       <w:pPr>
@@ -295,7 +293,6 @@
         </w:rPr>
         <w:t>{</w:t>
       </w:r>
-      <w:proofErr w:type="spellStart"/>
       <w:r>
         <w:rPr>
           <w:rFonts w:cstheme="minorHAnsi"/>
@@ -304,7 +301,6 @@
         </w:rPr>
         <w:t>EmployeeName</w:t>
       </w:r>
-      <w:proofErr w:type="spellEnd"/>
       <w:r>
         <w:rPr>
           <w:rFonts w:eastAsia="Times New Roman" w:cstheme="minorHAnsi"/>
@@ -400,23 +396,7 @@
           <w:rFonts w:eastAsia="Times New Roman" w:cstheme="minorHAnsi"/>
           <w:b/>
         </w:rPr>
-        <w:t>{</w:t>
-      </w:r>
-      <w:proofErr w:type="spellStart"/>
-      <w:r>
-        <w:rPr>
-          <w:rFonts w:eastAsia="Times New Roman" w:cstheme="minorHAnsi"/>
-          <w:b/>
-        </w:rPr>
-        <w:t>FatherName</w:t>
-      </w:r>
-      <w:proofErr w:type="spellEnd"/>
-      <w:r>
-        <w:rPr>
-          <w:rFonts w:eastAsia="Times New Roman" w:cstheme="minorHAnsi"/>
-          <w:b/>
-        </w:rPr>
-        <w:t>}</w:t>
+        <w:t>{FatherName}</w:t>
       </w:r>
     </w:p>
     <w:p>
@@ -778,27 +758,7 @@
           <w:kern w:val="2"/>
         </w:rPr>
         <w:tab/>
-        <w:t>: {</w:t>
-      </w:r>
-      <w:proofErr w:type="spellStart"/>
-      <w:r>
-        <w:rPr>
-          <w:rFonts w:cstheme="minorHAnsi"/>
-          <w:b/>
-          <w:color w:val="000000"/>
-          <w:kern w:val="2"/>
-        </w:rPr>
-        <w:t>CivilStatus</w:t>
-      </w:r>
-      <w:proofErr w:type="spellEnd"/>
-      <w:r>
-        <w:rPr>
-          <w:rFonts w:cstheme="minorHAnsi"/>
-          <w:b/>
-          <w:color w:val="000000"/>
-          <w:kern w:val="2"/>
-        </w:rPr>
-        <w:t>}</w:t>
+        <w:t>: {CivilStatus}</w:t>
       </w:r>
     </w:p>
     <w:p>
@@ -936,7 +896,6 @@
         </w:rPr>
         <w:t>{</w:t>
       </w:r>
-      <w:proofErr w:type="spellStart"/>
       <w:r>
         <w:rPr>
           <w:rFonts w:cstheme="minorHAnsi"/>
@@ -946,7 +905,6 @@
         </w:rPr>
         <w:t>PFAccountNumber</w:t>
       </w:r>
-      <w:proofErr w:type="spellEnd"/>
       <w:r>
         <w:rPr>
           <w:rFonts w:cstheme="minorHAnsi"/>
@@ -1080,25 +1038,7 @@
           <w:b/>
           <w:color w:val="000000" w:themeColor="text1"/>
         </w:rPr>
-        <w:t>{</w:t>
-      </w:r>
-      <w:proofErr w:type="spellStart"/>
-      <w:r>
-        <w:rPr>
-          <w:rFonts w:cstheme="minorHAnsi"/>
-          <w:b/>
-          <w:color w:val="000000" w:themeColor="text1"/>
-        </w:rPr>
-        <w:t>PresentAddress</w:t>
-      </w:r>
-      <w:proofErr w:type="spellEnd"/>
-      <w:r>
-        <w:rPr>
-          <w:rFonts w:cstheme="minorHAnsi"/>
-          <w:b/>
-          <w:color w:val="000000" w:themeColor="text1"/>
-        </w:rPr>
-        <w:t>}</w:t>
+        <w:t>{PresentAddress}</w:t>
       </w:r>
     </w:p>
     <w:p>
@@ -1184,25 +1124,7 @@
           <w:b/>
           <w:color w:val="000000" w:themeColor="text1"/>
         </w:rPr>
-        <w:t>: {</w:t>
-      </w:r>
-      <w:proofErr w:type="spellStart"/>
-      <w:r>
-        <w:rPr>
-          <w:rFonts w:cstheme="minorHAnsi"/>
-          <w:b/>
-          <w:color w:val="000000" w:themeColor="text1"/>
-        </w:rPr>
-        <w:t>ParmanentAddress</w:t>
-      </w:r>
-      <w:proofErr w:type="spellEnd"/>
-      <w:r>
-        <w:rPr>
-          <w:rFonts w:cstheme="minorHAnsi"/>
-          <w:b/>
-          <w:color w:val="000000" w:themeColor="text1"/>
-        </w:rPr>
-        <w:t>}</w:t>
+        <w:t>: {ParmanentAddress}</w:t>
       </w:r>
     </w:p>
     <w:p>
@@ -1365,7 +1287,23 @@
           <w:b/>
           <w:color w:val="000000" w:themeColor="text1"/>
         </w:rPr>
-        <w:t>{DOJ}</w:t>
+        <w:t>{</w:t>
+      </w:r>
+      <w:r>
+        <w:rPr>
+          <w:rFonts w:cstheme="minorHAnsi"/>
+          <w:b/>
+          <w:color w:val="000000" w:themeColor="text1"/>
+        </w:rPr>
+        <w:t>DocDate</w:t>
+      </w:r>
+      <w:r>
+        <w:rPr>
+          <w:rFonts w:cstheme="minorHAnsi"/>
+          <w:b/>
+          <w:color w:val="000000" w:themeColor="text1"/>
+        </w:rPr>
+        <w:t>}</w:t>
       </w:r>
     </w:p>
     <w:p>
@@ -1865,21 +1803,7 @@
               <w:rPr>
                 <w:rFonts w:cstheme="minorHAnsi"/>
               </w:rPr>
-              <w:t>{</w:t>
-            </w:r>
-            <w:proofErr w:type="spellStart"/>
-            <w:r>
-              <w:rPr>
-                <w:rFonts w:cstheme="minorHAnsi"/>
-              </w:rPr>
-              <w:t>NomineeName</w:t>
-            </w:r>
-            <w:proofErr w:type="spellEnd"/>
-            <w:r>
-              <w:rPr>
-                <w:rFonts w:cstheme="minorHAnsi"/>
-              </w:rPr>
-              <w:t>}</w:t>
+              <w:t>{NomineeName}</w:t>
             </w:r>
           </w:p>
         </w:tc>
@@ -1939,21 +1863,7 @@
               <w:rPr>
                 <w:rFonts w:cstheme="minorHAnsi"/>
               </w:rPr>
-              <w:t>{</w:t>
-            </w:r>
-            <w:proofErr w:type="spellStart"/>
-            <w:r>
-              <w:rPr>
-                <w:rFonts w:cstheme="minorHAnsi"/>
-              </w:rPr>
-              <w:t>NomineeAddress</w:t>
-            </w:r>
-            <w:proofErr w:type="spellEnd"/>
-            <w:r>
-              <w:rPr>
-                <w:rFonts w:cstheme="minorHAnsi"/>
-              </w:rPr>
-              <w:t>}</w:t>
+              <w:t>{NomineeAddress}</w:t>
             </w:r>
           </w:p>
         </w:tc>
@@ -2012,21 +1922,7 @@
               <w:rPr>
                 <w:rFonts w:cstheme="minorHAnsi"/>
               </w:rPr>
-              <w:t>{</w:t>
-            </w:r>
-            <w:proofErr w:type="spellStart"/>
-            <w:r>
-              <w:rPr>
-                <w:rFonts w:cstheme="minorHAnsi"/>
-              </w:rPr>
-              <w:t>NomineeRelation</w:t>
-            </w:r>
-            <w:proofErr w:type="spellEnd"/>
-            <w:r>
-              <w:rPr>
-                <w:rFonts w:cstheme="minorHAnsi"/>
-              </w:rPr>
-              <w:t>}</w:t>
+              <w:t>{NomineeRelation}</w:t>
             </w:r>
           </w:p>
         </w:tc>
@@ -2085,21 +1981,7 @@
               <w:rPr>
                 <w:rFonts w:cstheme="minorHAnsi"/>
               </w:rPr>
-              <w:t>{</w:t>
-            </w:r>
-            <w:proofErr w:type="spellStart"/>
-            <w:r>
-              <w:rPr>
-                <w:rFonts w:cstheme="minorHAnsi"/>
-              </w:rPr>
-              <w:t>NomineeAge</w:t>
-            </w:r>
-            <w:proofErr w:type="spellEnd"/>
-            <w:r>
-              <w:rPr>
-                <w:rFonts w:cstheme="minorHAnsi"/>
-              </w:rPr>
-              <w:t>}</w:t>
+              <w:t>{NomineeAge}</w:t>
             </w:r>
             <w:r>
               <w:rPr>
@@ -4773,7 +4655,6 @@
               </w:rPr>
               <w:t>{</w:t>
             </w:r>
-            <w:proofErr w:type="spellStart"/>
             <w:r>
               <w:rPr>
                 <w:rFonts w:ascii="Arial" w:hAnsi="Arial" w:cs="Arial"/>
@@ -4785,7 +4666,6 @@
               </w:rPr>
               <w:t>MarriedEmpNomineeName</w:t>
             </w:r>
-            <w:proofErr w:type="spellEnd"/>
             <w:r>
               <w:rPr>
                 <w:rFonts w:cstheme="minorHAnsi"/>
@@ -4850,7 +4730,6 @@
               </w:rPr>
               <w:t>{</w:t>
             </w:r>
-            <w:proofErr w:type="spellStart"/>
             <w:r>
               <w:rPr>
                 <w:rFonts w:ascii="Arial" w:hAnsi="Arial" w:cs="Arial"/>
@@ -4862,7 +4741,6 @@
               </w:rPr>
               <w:t>MarriedEmpNomineeDOB</w:t>
             </w:r>
-            <w:proofErr w:type="spellEnd"/>
             <w:r>
               <w:rPr>
                 <w:rFonts w:cstheme="minorHAnsi"/>
@@ -4927,7 +4805,6 @@
               </w:rPr>
               <w:t>{</w:t>
             </w:r>
-            <w:proofErr w:type="spellStart"/>
             <w:r>
               <w:rPr>
                 <w:rFonts w:ascii="Arial" w:hAnsi="Arial" w:cs="Arial"/>
@@ -4939,7 +4816,6 @@
               </w:rPr>
               <w:t>MarriedEmpNomineeRelation</w:t>
             </w:r>
-            <w:proofErr w:type="spellEnd"/>
             <w:r>
               <w:rPr>
                 <w:rFonts w:cstheme="minorHAnsi"/>
@@ -5151,25 +5027,7 @@
           <w:color w:val="000000"/>
           <w:kern w:val="2"/>
         </w:rPr>
-        <w:t>I hereby nominate the following persons for receiving the monthly widow pension (admissible under para 16 2(a) (</w:t>
-      </w:r>
-      <w:proofErr w:type="spellStart"/>
-      <w:r>
-        <w:rPr>
-          <w:rFonts w:cstheme="minorHAnsi"/>
-          <w:color w:val="000000"/>
-          <w:kern w:val="2"/>
-        </w:rPr>
-        <w:t>i</w:t>
-      </w:r>
-      <w:proofErr w:type="spellEnd"/>
-      <w:r>
-        <w:rPr>
-          <w:rFonts w:cstheme="minorHAnsi"/>
-          <w:color w:val="000000"/>
-          <w:kern w:val="2"/>
-        </w:rPr>
-        <w:t>) and (ii) of Employees’ Pension Scheme, 1995 in the event of my death without leaving any eligible family member for receiving Pension.</w:t>
+        <w:t>I hereby nominate the following persons for receiving the monthly widow pension (admissible under para 16 2(a) (i) and (ii) of Employees’ Pension Scheme, 1995 in the event of my death without leaving any eligible family member for receiving Pension.</w:t>
       </w:r>
     </w:p>
     <w:p>
@@ -5407,7 +5265,6 @@
               </w:rPr>
               <w:t>{</w:t>
             </w:r>
-            <w:proofErr w:type="spellStart"/>
             <w:r>
               <w:rPr>
                 <w:rFonts w:ascii="Arial" w:hAnsi="Arial" w:cs="Arial"/>
@@ -5419,7 +5276,6 @@
               </w:rPr>
               <w:t>UnMarriedEmpNomineeName</w:t>
             </w:r>
-            <w:proofErr w:type="spellEnd"/>
             <w:r>
               <w:rPr>
                 <w:rFonts w:cstheme="minorHAnsi"/>
@@ -5484,7 +5340,6 @@
               </w:rPr>
               <w:t>{</w:t>
             </w:r>
-            <w:proofErr w:type="spellStart"/>
             <w:r>
               <w:rPr>
                 <w:rFonts w:ascii="Arial" w:hAnsi="Arial" w:cs="Arial"/>
@@ -5496,7 +5351,6 @@
               </w:rPr>
               <w:t>UnMarriedEmpNomineeAge</w:t>
             </w:r>
-            <w:proofErr w:type="spellEnd"/>
             <w:r>
               <w:rPr>
                 <w:rFonts w:cstheme="minorHAnsi"/>
@@ -5561,7 +5415,6 @@
               </w:rPr>
               <w:t>{</w:t>
             </w:r>
-            <w:proofErr w:type="spellStart"/>
             <w:r>
               <w:rPr>
                 <w:rFonts w:ascii="Arial" w:hAnsi="Arial" w:cs="Arial"/>
@@ -5573,7 +5426,6 @@
               </w:rPr>
               <w:t>UnMarriedEmpNomineeRelation</w:t>
             </w:r>
-            <w:proofErr w:type="spellEnd"/>
             <w:r>
               <w:rPr>
                 <w:rFonts w:cstheme="minorHAnsi"/>
@@ -6772,23 +6624,13 @@
           <w:kern w:val="2"/>
         </w:rPr>
       </w:pPr>
-      <w:proofErr w:type="gramStart"/>
-      <w:r>
-        <w:rPr>
-          <w:rFonts w:cstheme="minorHAnsi"/>
-          <w:color w:val="000000"/>
-          <w:kern w:val="2"/>
-        </w:rPr>
-        <w:t>me</w:t>
-      </w:r>
-      <w:proofErr w:type="gramEnd"/>
-      <w:r>
-        <w:rPr>
-          <w:rFonts w:cstheme="minorHAnsi"/>
-          <w:color w:val="000000"/>
-          <w:kern w:val="2"/>
-        </w:rPr>
-        <w:t xml:space="preserve"> by Shri/Smt./</w:t>
+      <w:r>
+        <w:rPr>
+          <w:rFonts w:cstheme="minorHAnsi"/>
+          <w:color w:val="000000"/>
+          <w:kern w:val="2"/>
+        </w:rPr>
+        <w:t>me by Shri/Smt./</w:t>
       </w:r>
       <w:r>
         <w:rPr>
@@ -6806,7 +6648,6 @@
         </w:rPr>
         <w:t>{</w:t>
       </w:r>
-      <w:proofErr w:type="spellStart"/>
       <w:r>
         <w:rPr>
           <w:rFonts w:cstheme="minorHAnsi"/>
@@ -6815,7 +6656,6 @@
         </w:rPr>
         <w:t>EmployeeName</w:t>
       </w:r>
-      <w:proofErr w:type="spellEnd"/>
       <w:r>
         <w:rPr>
           <w:rFonts w:eastAsia="Times New Roman" w:cstheme="minorHAnsi"/>
@@ -7002,35 +6842,7 @@
           <w:color w:val="000000"/>
           <w:kern w:val="2"/>
         </w:rPr>
-        <w:t xml:space="preserve"> (</w:t>
-      </w:r>
-      <w:proofErr w:type="gramStart"/>
-      <w:r>
-        <w:rPr>
-          <w:rFonts w:cstheme="minorHAnsi"/>
-          <w:color w:val="000000"/>
-          <w:kern w:val="2"/>
-        </w:rPr>
-        <w:t>PSL ,</w:t>
-      </w:r>
-      <w:proofErr w:type="spellStart"/>
-      <w:r>
-        <w:rPr>
-          <w:rFonts w:cstheme="minorHAnsi"/>
-          <w:color w:val="000000"/>
-          <w:kern w:val="2"/>
-        </w:rPr>
-        <w:t>Pithampur</w:t>
-      </w:r>
-      <w:proofErr w:type="spellEnd"/>
-      <w:proofErr w:type="gramEnd"/>
-      <w:r>
-        <w:rPr>
-          <w:rFonts w:cstheme="minorHAnsi"/>
-          <w:color w:val="000000"/>
-          <w:kern w:val="2"/>
-        </w:rPr>
-        <w:t>)</w:t>
+        <w:t xml:space="preserve"> (PSL ,Pithampur)</w:t>
       </w:r>
     </w:p>
     <w:p>
@@ -7088,19 +6900,8 @@
           <w:color w:val="000000"/>
           <w:kern w:val="2"/>
         </w:rPr>
-        <w:t xml:space="preserve">Dated </w:t>
-      </w:r>
-      <w:proofErr w:type="gramStart"/>
-      <w:r>
-        <w:rPr>
-          <w:rFonts w:cstheme="minorHAnsi"/>
-          <w:b/>
-          <w:color w:val="000000"/>
-          <w:kern w:val="2"/>
-        </w:rPr>
-        <w:t>the :</w:t>
-      </w:r>
-      <w:proofErr w:type="gramEnd"/>
+        <w:t>Dated the :</w:t>
+      </w:r>
       <w:r>
         <w:rPr>
           <w:rFonts w:cstheme="minorHAnsi"/>
@@ -7958,19 +7759,8 @@
           <w:color w:val="000000"/>
           <w:kern w:val="2"/>
         </w:rPr>
-        <w:t xml:space="preserve">Signature or the employer or other </w:t>
-      </w:r>
-      <w:proofErr w:type="spellStart"/>
-      <w:r>
-        <w:rPr>
-          <w:rFonts w:cstheme="minorHAnsi"/>
-          <w:b/>
-          <w:color w:val="000000"/>
-          <w:kern w:val="2"/>
-        </w:rPr>
-        <w:t>authorised</w:t>
-      </w:r>
-      <w:proofErr w:type="spellEnd"/>
+        <w:t>Signature or the employer or other authorised</w:t>
+      </w:r>
     </w:p>
     <w:p>
       <w:pPr>
@@ -8055,45 +7845,14 @@
           <w:kern w:val="2"/>
         </w:rPr>
       </w:pPr>
-      <w:proofErr w:type="spellStart"/>
-      <w:r>
-        <w:rPr>
-          <w:rFonts w:cstheme="minorHAnsi"/>
-          <w:b/>
-          <w:color w:val="000000"/>
-          <w:kern w:val="2"/>
-        </w:rPr>
-        <w:t>Pratibha</w:t>
-      </w:r>
-      <w:proofErr w:type="spellEnd"/>
-      <w:r>
-        <w:rPr>
-          <w:rFonts w:cstheme="minorHAnsi"/>
-          <w:b/>
-          <w:color w:val="000000"/>
-          <w:kern w:val="2"/>
-        </w:rPr>
-        <w:t xml:space="preserve"> </w:t>
-      </w:r>
-      <w:proofErr w:type="spellStart"/>
-      <w:r>
-        <w:rPr>
-          <w:rFonts w:cstheme="minorHAnsi"/>
-          <w:b/>
-          <w:color w:val="000000"/>
-          <w:kern w:val="2"/>
-        </w:rPr>
-        <w:t>Syntex</w:t>
-      </w:r>
-      <w:proofErr w:type="spellEnd"/>
-      <w:r>
-        <w:rPr>
-          <w:rFonts w:cstheme="minorHAnsi"/>
-          <w:b/>
-          <w:color w:val="000000"/>
-          <w:kern w:val="2"/>
-        </w:rPr>
-        <w:t xml:space="preserve"> Ltd</w:t>
+      <w:r>
+        <w:rPr>
+          <w:rFonts w:cstheme="minorHAnsi"/>
+          <w:b/>
+          <w:color w:val="000000"/>
+          <w:kern w:val="2"/>
+        </w:rPr>
+        <w:t>Pratibha Syntex Ltd</w:t>
       </w:r>
     </w:p>
     <w:p>
@@ -8132,25 +7891,7 @@
           <w:color w:val="000000"/>
           <w:kern w:val="2"/>
         </w:rPr>
-        <w:t xml:space="preserve">Plot No. 4 Industrial Growth Centre, </w:t>
-      </w:r>
-      <w:proofErr w:type="spellStart"/>
-      <w:r>
-        <w:rPr>
-          <w:rFonts w:cstheme="minorHAnsi"/>
-          <w:color w:val="000000"/>
-          <w:kern w:val="2"/>
-        </w:rPr>
-        <w:t>Kheda</w:t>
-      </w:r>
-      <w:proofErr w:type="spellEnd"/>
-      <w:r>
-        <w:rPr>
-          <w:rFonts w:cstheme="minorHAnsi"/>
-          <w:color w:val="000000"/>
-          <w:kern w:val="2"/>
-        </w:rPr>
-        <w:t xml:space="preserve"> </w:t>
+        <w:t xml:space="preserve">Plot No. 4 Industrial Growth Centre, Kheda </w:t>
       </w:r>
       <w:r>
         <w:rPr>
@@ -8192,59 +7933,13 @@
           <w:kern w:val="2"/>
         </w:rPr>
       </w:pPr>
-      <w:proofErr w:type="spellStart"/>
-      <w:r>
-        <w:rPr>
-          <w:rFonts w:cstheme="minorHAnsi"/>
-          <w:color w:val="000000"/>
-          <w:kern w:val="2"/>
-        </w:rPr>
-        <w:t>Pithampur</w:t>
-      </w:r>
-      <w:proofErr w:type="spellEnd"/>
-      <w:r>
-        <w:rPr>
-          <w:rFonts w:cstheme="minorHAnsi"/>
-          <w:color w:val="000000"/>
-          <w:kern w:val="2"/>
-        </w:rPr>
-        <w:t xml:space="preserve">, </w:t>
-      </w:r>
-      <w:proofErr w:type="spellStart"/>
-      <w:r>
-        <w:rPr>
-          <w:rFonts w:cstheme="minorHAnsi"/>
-          <w:color w:val="000000"/>
-          <w:kern w:val="2"/>
-        </w:rPr>
-        <w:t>Distt</w:t>
-      </w:r>
-      <w:proofErr w:type="spellEnd"/>
-      <w:r>
-        <w:rPr>
-          <w:rFonts w:cstheme="minorHAnsi"/>
-          <w:color w:val="000000"/>
-          <w:kern w:val="2"/>
-        </w:rPr>
-        <w:t xml:space="preserve"> </w:t>
-      </w:r>
-      <w:proofErr w:type="spellStart"/>
-      <w:r>
-        <w:rPr>
-          <w:rFonts w:cstheme="minorHAnsi"/>
-          <w:color w:val="000000"/>
-          <w:kern w:val="2"/>
-        </w:rPr>
-        <w:t>Dhar</w:t>
-      </w:r>
-      <w:proofErr w:type="spellEnd"/>
-      <w:r>
-        <w:rPr>
-          <w:rFonts w:cstheme="minorHAnsi"/>
-          <w:color w:val="000000"/>
-          <w:kern w:val="2"/>
-        </w:rPr>
-        <w:t xml:space="preserve"> (M.P.) India</w:t>
+      <w:r>
+        <w:rPr>
+          <w:rFonts w:cstheme="minorHAnsi"/>
+          <w:color w:val="000000"/>
+          <w:kern w:val="2"/>
+        </w:rPr>
+        <w:t>Pithampur, Distt Dhar (M.P.) India</w:t>
       </w:r>
     </w:p>
     <w:p>
@@ -8358,25 +8053,14 @@
           <w:kern w:val="2"/>
         </w:rPr>
       </w:pPr>
-      <w:proofErr w:type="gramStart"/>
-      <w:r>
-        <w:rPr>
-          <w:rFonts w:cstheme="minorHAnsi"/>
-          <w:b/>
-          <w:color w:val="000000"/>
-          <w:kern w:val="2"/>
-        </w:rPr>
-        <w:t>or</w:t>
-      </w:r>
-      <w:proofErr w:type="gramEnd"/>
-      <w:r>
-        <w:rPr>
-          <w:rFonts w:cstheme="minorHAnsi"/>
-          <w:b/>
-          <w:color w:val="000000"/>
-          <w:kern w:val="2"/>
-        </w:rPr>
-        <w:t xml:space="preserve"> rubber stamp there of</w:t>
+      <w:r>
+        <w:rPr>
+          <w:rFonts w:cstheme="minorHAnsi"/>
+          <w:b/>
+          <w:color w:val="000000"/>
+          <w:kern w:val="2"/>
+        </w:rPr>
+        <w:t>or rubber stamp there of</w:t>
       </w:r>
     </w:p>
     <w:sectPr>
@@ -8391,7 +8075,7 @@
 </file>
 
 <file path=word/endnotes.xml><?xml version="1.0" encoding="utf-8"?>
-<w:endnotes xmlns:wpc="http://schemas.microsoft.com/office/word/2010/wordprocessingCanvas" xmlns:mc="http://schemas.openxmlformats.org/markup-compatibility/2006" xmlns:o="urn:schemas-microsoft-com:office:office" xmlns:r="http://schemas.openxmlformats.org/officeDocument/2006/relationships" xmlns:m="http://schemas.openxmlformats.org/officeDocument/2006/math" xmlns:v="urn:schemas-microsoft-com:vml" xmlns:wp14="http://schemas.microsoft.com/office/word/2010/wordprocessingDrawing" xmlns:wp="http://schemas.openxmlformats.org/drawingml/2006/wordprocessingDrawing" xmlns:w10="urn:schemas-microsoft-com:office:word" xmlns:w="http://schemas.openxmlformats.org/wordprocessingml/2006/main" xmlns:w14="http://schemas.microsoft.com/office/word/2010/wordml" xmlns:w15="http://schemas.microsoft.com/office/word/2012/wordml" xmlns:wpg="http://schemas.microsoft.com/office/word/2010/wordprocessingGroup" xmlns:wpi="http://schemas.microsoft.com/office/word/2010/wordprocessingInk" xmlns:wne="http://schemas.microsoft.com/office/word/2006/wordml" xmlns:wps="http://schemas.microsoft.com/office/word/2010/wordprocessingShape" mc:Ignorable="w14 w15 wp14">
+<w:endnotes xmlns:wpc="http://schemas.microsoft.com/office/word/2010/wordprocessingCanvas" xmlns:cx="http://schemas.microsoft.com/office/drawing/2014/chartex" xmlns:cx1="http://schemas.microsoft.com/office/drawing/2015/9/8/chartex" xmlns:cx2="http://schemas.microsoft.com/office/drawing/2015/10/21/chartex" xmlns:cx3="http://schemas.microsoft.com/office/drawing/2016/5/9/chartex" xmlns:cx4="http://schemas.microsoft.com/office/drawing/2016/5/10/chartex" xmlns:cx5="http://schemas.microsoft.com/office/drawing/2016/5/11/chartex" xmlns:cx6="http://schemas.microsoft.com/office/drawing/2016/5/12/chartex" xmlns:cx7="http://schemas.microsoft.com/office/drawing/2016/5/13/chartex" xmlns:cx8="http://schemas.microsoft.com/office/drawing/2016/5/14/chartex" xmlns:mc="http://schemas.openxmlformats.org/markup-compatibility/2006" xmlns:aink="http://schemas.microsoft.com/office/drawing/2016/ink" xmlns:am3d="http://schemas.microsoft.com/office/drawing/2017/model3d" xmlns:o="urn:schemas-microsoft-com:office:office" xmlns:r="http://schemas.openxmlformats.org/officeDocument/2006/relationships" xmlns:m="http://schemas.openxmlformats.org/officeDocument/2006/math" xmlns:v="urn:schemas-microsoft-com:vml" xmlns:wp14="http://schemas.microsoft.com/office/word/2010/wordprocessingDrawing" xmlns:wp="http://schemas.openxmlformats.org/drawingml/2006/wordprocessingDrawing" xmlns:w10="urn:schemas-microsoft-com:office:word" xmlns:w="http://schemas.openxmlformats.org/wordprocessingml/2006/main" xmlns:w14="http://schemas.microsoft.com/office/word/2010/wordml" xmlns:w15="http://schemas.microsoft.com/office/word/2012/wordml" xmlns:w16cex="http://schemas.microsoft.com/office/word/2018/wordml/cex" xmlns:w16cid="http://schemas.microsoft.com/office/word/2016/wordml/cid" xmlns:w16="http://schemas.microsoft.com/office/word/2018/wordml" xmlns:w16sdtdh="http://schemas.microsoft.com/office/word/2020/wordml/sdtdatahash" xmlns:w16se="http://schemas.microsoft.com/office/word/2015/wordml/symex" xmlns:wpg="http://schemas.microsoft.com/office/word/2010/wordprocessingGroup" xmlns:wpi="http://schemas.microsoft.com/office/word/2010/wordprocessingInk" xmlns:wne="http://schemas.microsoft.com/office/word/2006/wordml" xmlns:wps="http://schemas.microsoft.com/office/word/2010/wordprocessingShape" mc:Ignorable="w14 w15 w16se w16cid w16 w16cex w16sdtdh wp14">
   <w:endnote w:type="separator" w:id="-1">
     <w:p>
       <w:pPr>
@@ -8416,7 +8100,7 @@
 </file>
 
 <file path=word/footnotes.xml><?xml version="1.0" encoding="utf-8"?>
-<w:footnotes xmlns:wpc="http://schemas.microsoft.com/office/word/2010/wordprocessingCanvas" xmlns:mc="http://schemas.openxmlformats.org/markup-compatibility/2006" xmlns:o="urn:schemas-microsoft-com:office:office" xmlns:r="http://schemas.openxmlformats.org/officeDocument/2006/relationships" xmlns:m="http://schemas.openxmlformats.org/officeDocument/2006/math" xmlns:v="urn:schemas-microsoft-com:vml" xmlns:wp14="http://schemas.microsoft.com/office/word/2010/wordprocessingDrawing" xmlns:wp="http://schemas.openxmlformats.org/drawingml/2006/wordprocessingDrawing" xmlns:w10="urn:schemas-microsoft-com:office:word" xmlns:w="http://schemas.openxmlformats.org/wordprocessingml/2006/main" xmlns:w14="http://schemas.microsoft.com/office/word/2010/wordml" xmlns:w15="http://schemas.microsoft.com/office/word/2012/wordml" xmlns:wpg="http://schemas.microsoft.com/office/word/2010/wordprocessingGroup" xmlns:wpi="http://schemas.microsoft.com/office/word/2010/wordprocessingInk" xmlns:wne="http://schemas.microsoft.com/office/word/2006/wordml" xmlns:wps="http://schemas.microsoft.com/office/word/2010/wordprocessingShape" mc:Ignorable="w14 w15 wp14">
+<w:footnotes xmlns:wpc="http://schemas.microsoft.com/office/word/2010/wordprocessingCanvas" xmlns:cx="http://schemas.microsoft.com/office/drawing/2014/chartex" xmlns:cx1="http://schemas.microsoft.com/office/drawing/2015/9/8/chartex" xmlns:cx2="http://schemas.microsoft.com/office/drawing/2015/10/21/chartex" xmlns:cx3="http://schemas.microsoft.com/office/drawing/2016/5/9/chartex" xmlns:cx4="http://schemas.microsoft.com/office/drawing/2016/5/10/chartex" xmlns:cx5="http://schemas.microsoft.com/office/drawing/2016/5/11/chartex" xmlns:cx6="http://schemas.microsoft.com/office/drawing/2016/5/12/chartex" xmlns:cx7="http://schemas.microsoft.com/office/drawing/2016/5/13/chartex" xmlns:cx8="http://schemas.microsoft.com/office/drawing/2016/5/14/chartex" xmlns:mc="http://schemas.openxmlformats.org/markup-compatibility/2006" xmlns:aink="http://schemas.microsoft.com/office/drawing/2016/ink" xmlns:am3d="http://schemas.microsoft.com/office/drawing/2017/model3d" xmlns:o="urn:schemas-microsoft-com:office:office" xmlns:r="http://schemas.openxmlformats.org/officeDocument/2006/relationships" xmlns:m="http://schemas.openxmlformats.org/officeDocument/2006/math" xmlns:v="urn:schemas-microsoft-com:vml" xmlns:wp14="http://schemas.microsoft.com/office/word/2010/wordprocessingDrawing" xmlns:wp="http://schemas.openxmlformats.org/drawingml/2006/wordprocessingDrawing" xmlns:w10="urn:schemas-microsoft-com:office:word" xmlns:w="http://schemas.openxmlformats.org/wordprocessingml/2006/main" xmlns:w14="http://schemas.microsoft.com/office/word/2010/wordml" xmlns:w15="http://schemas.microsoft.com/office/word/2012/wordml" xmlns:w16cex="http://schemas.microsoft.com/office/word/2018/wordml/cex" xmlns:w16cid="http://schemas.microsoft.com/office/word/2016/wordml/cid" xmlns:w16="http://schemas.microsoft.com/office/word/2018/wordml" xmlns:w16sdtdh="http://schemas.microsoft.com/office/word/2020/wordml/sdtdatahash" xmlns:w16se="http://schemas.microsoft.com/office/word/2015/wordml/symex" xmlns:wpg="http://schemas.microsoft.com/office/word/2010/wordprocessingGroup" xmlns:wpi="http://schemas.microsoft.com/office/word/2010/wordprocessingInk" xmlns:wne="http://schemas.microsoft.com/office/word/2006/wordml" xmlns:wps="http://schemas.microsoft.com/office/word/2010/wordprocessingShape" mc:Ignorable="w14 w15 w16se w16cid w16 w16cex w16sdtdh wp14">
   <w:footnote w:type="separator" w:id="-1">
     <w:p>
       <w:pPr>
@@ -8441,7 +8125,7 @@
 </file>
 
 <file path=word/header1.xml><?xml version="1.0" encoding="utf-8"?>
-<w:hdr xmlns:wpc="http://schemas.microsoft.com/office/word/2010/wordprocessingCanvas" xmlns:mc="http://schemas.openxmlformats.org/markup-compatibility/2006" xmlns:o="urn:schemas-microsoft-com:office:office" xmlns:r="http://schemas.openxmlformats.org/officeDocument/2006/relationships" xmlns:m="http://schemas.openxmlformats.org/officeDocument/2006/math" xmlns:v="urn:schemas-microsoft-com:vml" xmlns:wp14="http://schemas.microsoft.com/office/word/2010/wordprocessingDrawing" xmlns:wp="http://schemas.openxmlformats.org/drawingml/2006/wordprocessingDrawing" xmlns:w10="urn:schemas-microsoft-com:office:word" xmlns:w="http://schemas.openxmlformats.org/wordprocessingml/2006/main" xmlns:w14="http://schemas.microsoft.com/office/word/2010/wordml" xmlns:w15="http://schemas.microsoft.com/office/word/2012/wordml" xmlns:wpg="http://schemas.microsoft.com/office/word/2010/wordprocessingGroup" xmlns:wpi="http://schemas.microsoft.com/office/word/2010/wordprocessingInk" xmlns:wne="http://schemas.microsoft.com/office/word/2006/wordml" xmlns:wps="http://schemas.microsoft.com/office/word/2010/wordprocessingShape" mc:Ignorable="w14 w15 wp14">
+<w:hdr xmlns:wpc="http://schemas.microsoft.com/office/word/2010/wordprocessingCanvas" xmlns:cx="http://schemas.microsoft.com/office/drawing/2014/chartex" xmlns:cx1="http://schemas.microsoft.com/office/drawing/2015/9/8/chartex" xmlns:cx2="http://schemas.microsoft.com/office/drawing/2015/10/21/chartex" xmlns:cx3="http://schemas.microsoft.com/office/drawing/2016/5/9/chartex" xmlns:cx4="http://schemas.microsoft.com/office/drawing/2016/5/10/chartex" xmlns:cx5="http://schemas.microsoft.com/office/drawing/2016/5/11/chartex" xmlns:cx6="http://schemas.microsoft.com/office/drawing/2016/5/12/chartex" xmlns:cx7="http://schemas.microsoft.com/office/drawing/2016/5/13/chartex" xmlns:cx8="http://schemas.microsoft.com/office/drawing/2016/5/14/chartex" xmlns:mc="http://schemas.openxmlformats.org/markup-compatibility/2006" xmlns:aink="http://schemas.microsoft.com/office/drawing/2016/ink" xmlns:am3d="http://schemas.microsoft.com/office/drawing/2017/model3d" xmlns:o="urn:schemas-microsoft-com:office:office" xmlns:r="http://schemas.openxmlformats.org/officeDocument/2006/relationships" xmlns:m="http://schemas.openxmlformats.org/officeDocument/2006/math" xmlns:v="urn:schemas-microsoft-com:vml" xmlns:wp14="http://schemas.microsoft.com/office/word/2010/wordprocessingDrawing" xmlns:wp="http://schemas.openxmlformats.org/drawingml/2006/wordprocessingDrawing" xmlns:w10="urn:schemas-microsoft-com:office:word" xmlns:w="http://schemas.openxmlformats.org/wordprocessingml/2006/main" xmlns:w14="http://schemas.microsoft.com/office/word/2010/wordml" xmlns:w15="http://schemas.microsoft.com/office/word/2012/wordml" xmlns:w16cex="http://schemas.microsoft.com/office/word/2018/wordml/cex" xmlns:w16cid="http://schemas.microsoft.com/office/word/2016/wordml/cid" xmlns:w16="http://schemas.microsoft.com/office/word/2018/wordml" xmlns:w16sdtdh="http://schemas.microsoft.com/office/word/2020/wordml/sdtdatahash" xmlns:w16se="http://schemas.microsoft.com/office/word/2015/wordml/symex" xmlns:wpg="http://schemas.microsoft.com/office/word/2010/wordprocessingGroup" xmlns:wpi="http://schemas.microsoft.com/office/word/2010/wordprocessingInk" xmlns:wne="http://schemas.microsoft.com/office/word/2006/wordml" xmlns:wps="http://schemas.microsoft.com/office/word/2010/wordprocessingShape" mc:Ignorable="w14 w15 w16se w16cid w16 w16cex w16sdtdh wp14">
   <w:p>
     <w:pPr>
       <w:widowControl w:val="0"/>
@@ -8502,7 +8186,7 @@
         <w:szCs w:val="24"/>
       </w:rPr>
       <w:drawing>
-        <wp:anchor distT="0" distB="0" distL="114300" distR="114300" simplePos="0" relativeHeight="251658240" behindDoc="0" locked="0" layoutInCell="1" allowOverlap="1">
+        <wp:anchor distT="0" distB="0" distL="114300" distR="114300" simplePos="0" relativeHeight="251658240" behindDoc="0" locked="0" layoutInCell="1" allowOverlap="1" wp14:anchorId="653F00CE" wp14:editId="3D0EBE4C">
           <wp:simplePos x="0" y="0"/>
           <wp:positionH relativeFrom="column">
             <wp:posOffset>390525</wp:posOffset>
@@ -8633,29 +8317,7 @@
         <w:sz w:val="19"/>
         <w:szCs w:val="24"/>
       </w:rPr>
-      <w:t xml:space="preserve">(For </w:t>
-    </w:r>
-    <w:proofErr w:type="spellStart"/>
-    <w:r>
-      <w:rPr>
-        <w:rFonts w:ascii="Times New Roman" w:hAnsi="Times New Roman"/>
-        <w:color w:val="000000"/>
-        <w:kern w:val="2"/>
-        <w:sz w:val="19"/>
-        <w:szCs w:val="24"/>
-      </w:rPr>
-      <w:t>Unexempted</w:t>
-    </w:r>
-    <w:proofErr w:type="spellEnd"/>
-    <w:r>
-      <w:rPr>
-        <w:rFonts w:ascii="Times New Roman" w:hAnsi="Times New Roman"/>
-        <w:color w:val="000000"/>
-        <w:kern w:val="2"/>
-        <w:sz w:val="19"/>
-        <w:szCs w:val="24"/>
-      </w:rPr>
-      <w:t xml:space="preserve"> / Exempted Establishment)</w:t>
+      <w:t>(For Unexempted / Exempted Establishment)</w:t>
     </w:r>
   </w:p>
   <w:p>
@@ -8908,7 +8570,7 @@
 </file>
 
 <file path=word/numbering.xml><?xml version="1.0" encoding="utf-8"?>
-<w:numbering xmlns:wpc="http://schemas.microsoft.com/office/word/2010/wordprocessingCanvas" xmlns:mc="http://schemas.openxmlformats.org/markup-compatibility/2006" xmlns:o="urn:schemas-microsoft-com:office:office" xmlns:r="http://schemas.openxmlformats.org/officeDocument/2006/relationships" xmlns:m="http://schemas.openxmlformats.org/officeDocument/2006/math" xmlns:v="urn:schemas-microsoft-com:vml" xmlns:wp14="http://schemas.microsoft.com/office/word/2010/wordprocessingDrawing" xmlns:wp="http://schemas.openxmlformats.org/drawingml/2006/wordprocessingDrawing" xmlns:w10="urn:schemas-microsoft-com:office:word" xmlns:w="http://schemas.openxmlformats.org/wordprocessingml/2006/main" xmlns:w14="http://schemas.microsoft.com/office/word/2010/wordml" xmlns:w15="http://schemas.microsoft.com/office/word/2012/wordml" xmlns:wpg="http://schemas.microsoft.com/office/word/2010/wordprocessingGroup" xmlns:wpi="http://schemas.microsoft.com/office/word/2010/wordprocessingInk" xmlns:wne="http://schemas.microsoft.com/office/word/2006/wordml" xmlns:wps="http://schemas.microsoft.com/office/word/2010/wordprocessingShape" mc:Ignorable="w14 w15 wp14">
+<w:numbering xmlns:wpc="http://schemas.microsoft.com/office/word/2010/wordprocessingCanvas" xmlns:cx="http://schemas.microsoft.com/office/drawing/2014/chartex" xmlns:cx1="http://schemas.microsoft.com/office/drawing/2015/9/8/chartex" xmlns:cx2="http://schemas.microsoft.com/office/drawing/2015/10/21/chartex" xmlns:cx3="http://schemas.microsoft.com/office/drawing/2016/5/9/chartex" xmlns:cx4="http://schemas.microsoft.com/office/drawing/2016/5/10/chartex" xmlns:cx5="http://schemas.microsoft.com/office/drawing/2016/5/11/chartex" xmlns:cx6="http://schemas.microsoft.com/office/drawing/2016/5/12/chartex" xmlns:cx7="http://schemas.microsoft.com/office/drawing/2016/5/13/chartex" xmlns:cx8="http://schemas.microsoft.com/office/drawing/2016/5/14/chartex" xmlns:mc="http://schemas.openxmlformats.org/markup-compatibility/2006" xmlns:aink="http://schemas.microsoft.com/office/drawing/2016/ink" xmlns:am3d="http://schemas.microsoft.com/office/drawing/2017/model3d" xmlns:o="urn:schemas-microsoft-com:office:office" xmlns:r="http://schemas.openxmlformats.org/officeDocument/2006/relationships" xmlns:m="http://schemas.openxmlformats.org/officeDocument/2006/math" xmlns:v="urn:schemas-microsoft-com:vml" xmlns:wp14="http://schemas.microsoft.com/office/word/2010/wordprocessingDrawing" xmlns:wp="http://schemas.openxmlformats.org/drawingml/2006/wordprocessingDrawing" xmlns:w10="urn:schemas-microsoft-com:office:word" xmlns:w="http://schemas.openxmlformats.org/wordprocessingml/2006/main" xmlns:w14="http://schemas.microsoft.com/office/word/2010/wordml" xmlns:w15="http://schemas.microsoft.com/office/word/2012/wordml" xmlns:w16cex="http://schemas.microsoft.com/office/word/2018/wordml/cex" xmlns:w16cid="http://schemas.microsoft.com/office/word/2016/wordml/cid" xmlns:w16="http://schemas.microsoft.com/office/word/2018/wordml" xmlns:w16sdtdh="http://schemas.microsoft.com/office/word/2020/wordml/sdtdatahash" xmlns:w16se="http://schemas.microsoft.com/office/word/2015/wordml/symex" xmlns:wpg="http://schemas.microsoft.com/office/word/2010/wordprocessingGroup" xmlns:wpi="http://schemas.microsoft.com/office/word/2010/wordprocessingInk" xmlns:wne="http://schemas.microsoft.com/office/word/2006/wordml" xmlns:wps="http://schemas.microsoft.com/office/word/2010/wordprocessingShape" mc:Ignorable="w14 w15 w16se w16cid w16 w16cex w16sdtdh wp14">
   <w:abstractNum w:abstractNumId="0" w15:restartNumberingAfterBreak="0">
     <w:nsid w:val="1DDD4FC1"/>
     <w:multiLevelType w:val="hybridMultilevel"/>
@@ -9005,7 +8667,7 @@
 </file>
 
 <file path=word/styles.xml><?xml version="1.0" encoding="utf-8"?>
-<w:styles xmlns:mc="http://schemas.openxmlformats.org/markup-compatibility/2006" xmlns:r="http://schemas.openxmlformats.org/officeDocument/2006/relationships" xmlns:w="http://schemas.openxmlformats.org/wordprocessingml/2006/main" xmlns:w14="http://schemas.microsoft.com/office/word/2010/wordml" xmlns:w15="http://schemas.microsoft.com/office/word/2012/wordml" mc:Ignorable="w14 w15">
+<w:styles xmlns:mc="http://schemas.openxmlformats.org/markup-compatibility/2006" xmlns:r="http://schemas.openxmlformats.org/officeDocument/2006/relationships" xmlns:w="http://schemas.openxmlformats.org/wordprocessingml/2006/main" xmlns:w14="http://schemas.microsoft.com/office/word/2010/wordml" xmlns:w15="http://schemas.microsoft.com/office/word/2012/wordml" xmlns:w16cex="http://schemas.microsoft.com/office/word/2018/wordml/cex" xmlns:w16cid="http://schemas.microsoft.com/office/word/2016/wordml/cid" xmlns:w16="http://schemas.microsoft.com/office/word/2018/wordml" xmlns:w16sdtdh="http://schemas.microsoft.com/office/word/2020/wordml/sdtdatahash" xmlns:w16se="http://schemas.microsoft.com/office/word/2015/wordml/symex" mc:Ignorable="w14 w15 w16se w16cid w16 w16cex w16sdtdh">
   <w:docDefaults>
     <w:rPrDefault>
       <w:rPr>
@@ -9021,7 +8683,7 @@
       </w:pPr>
     </w:pPrDefault>
   </w:docDefaults>
-  <w:latentStyles w:defLockedState="0" w:defUIPriority="99" w:defSemiHidden="0" w:defUnhideWhenUsed="0" w:defQFormat="0" w:count="371">
+  <w:latentStyles w:defLockedState="0" w:defUIPriority="99" w:defSemiHidden="0" w:defUnhideWhenUsed="0" w:defQFormat="0" w:count="376">
     <w:lsdException w:name="Normal" w:uiPriority="0" w:qFormat="1"/>
     <w:lsdException w:name="heading 1" w:uiPriority="9" w:qFormat="1"/>
     <w:lsdException w:name="heading 2" w:semiHidden="1" w:uiPriority="9" w:unhideWhenUsed="1" w:qFormat="1"/>
@@ -9127,7 +8789,6 @@
     <w:lsdException w:name="HTML Sample" w:semiHidden="1" w:unhideWhenUsed="1"/>
     <w:lsdException w:name="HTML Typewriter" w:semiHidden="1" w:unhideWhenUsed="1"/>
     <w:lsdException w:name="HTML Variable" w:semiHidden="1" w:unhideWhenUsed="1"/>
-    <w:lsdException w:name="Normal Table" w:semiHidden="1" w:unhideWhenUsed="1"/>
     <w:lsdException w:name="annotation subject" w:semiHidden="1" w:unhideWhenUsed="1"/>
     <w:lsdException w:name="No List" w:semiHidden="1" w:unhideWhenUsed="1"/>
     <w:lsdException w:name="Outline List 1" w:semiHidden="1" w:unhideWhenUsed="1"/>
@@ -9170,11 +8831,8 @@
     <w:lsdException w:name="Table Contemporary" w:semiHidden="1" w:unhideWhenUsed="1"/>
     <w:lsdException w:name="Table Elegant" w:semiHidden="1" w:unhideWhenUsed="1"/>
     <w:lsdException w:name="Table Professional" w:semiHidden="1" w:unhideWhenUsed="1"/>
-    <w:lsdException w:name="Table Subtle 1" w:semiHidden="1" w:unhideWhenUsed="1"/>
     <w:lsdException w:name="Table Subtle 2" w:semiHidden="1" w:unhideWhenUsed="1"/>
     <w:lsdException w:name="Table Web 1" w:semiHidden="1" w:unhideWhenUsed="1"/>
-    <w:lsdException w:name="Table Web 2" w:semiHidden="1" w:unhideWhenUsed="1"/>
-    <w:lsdException w:name="Table Web 3" w:semiHidden="1" w:unhideWhenUsed="1"/>
     <w:lsdException w:name="Balloon Text" w:semiHidden="1" w:unhideWhenUsed="1"/>
     <w:lsdException w:name="Table Grid" w:uiPriority="39"/>
     <w:lsdException w:name="Table Theme" w:semiHidden="1" w:unhideWhenUsed="1"/>
@@ -9393,6 +9051,11 @@
     <w:lsdException w:name="List Table 5 Dark Accent 6" w:uiPriority="50"/>
     <w:lsdException w:name="List Table 6 Colorful Accent 6" w:uiPriority="51"/>
     <w:lsdException w:name="List Table 7 Colorful Accent 6" w:uiPriority="52"/>
+    <w:lsdException w:name="Mention" w:semiHidden="1" w:unhideWhenUsed="1"/>
+    <w:lsdException w:name="Smart Hyperlink" w:semiHidden="1" w:unhideWhenUsed="1"/>
+    <w:lsdException w:name="Hashtag" w:semiHidden="1" w:unhideWhenUsed="1"/>
+    <w:lsdException w:name="Unresolved Mention" w:semiHidden="1" w:unhideWhenUsed="1"/>
+    <w:lsdException w:name="Smart Link" w:semiHidden="1" w:unhideWhenUsed="1"/>
   </w:latentStyles>
   <w:style w:type="paragraph" w:default="1" w:styleId="Normal">
     <w:name w:val="Normal"/>

</xml_diff>